<commit_message>
Ajustar maquetación de los 3 formatos según CVs canon de Paola
Bullet nativo de Word en New Format, guion literal en Non Template/BD;
header de experiencia en 2 líneas con agrupación por empresa consecutiva
(blocks.build_experience_companies + dates.combine_periods); period
nullable en experience[]; BD sin "Resides in..." ni skills en el summary;
New Format con SKILLS antes de certificaciones y título corregido.

Co-Authored-By: Claude Sonnet 5 <noreply@anthropic.com>
</commit_message>
<xml_diff>
--- a/02-modulo2-agente-transformacion/microservicio/templates/anotados/BD - Resume Template.docx
+++ b/02-modulo2-agente-transformacion/microservicio/templates/anotados/BD - Resume Template.docx
@@ -38,183 +38,169 @@
           <w:bCs/>
           <w:u w:val="single"/>
         </w:rPr>
-        <w:t>Summary</w:t>
-      </w:r>
-      <w:r>
+        <w:t>Summary of Skills:</w:t>
+      </w:r>
+    </w:p>
+    <w:p>
+      <w:pPr>
+        <w:ind w:left="0" w:firstLine="0"/>
+      </w:pPr>
+      <w:r>
+        <w:rPr>
+          <w:b w:val="0"/>
+        </w:rPr>
+        <w:t>{{ summary }}</w:t>
+      </w:r>
+    </w:p>
+    <w:p>
+      <w:pPr>
         <w:rPr>
           <w:b/>
           <w:bCs/>
           <w:u w:val="single"/>
         </w:rPr>
-        <w:t xml:space="preserve"> of Skills</w:t>
-      </w:r>
-    </w:p>
-    <w:p>
-      <w:pPr>
-        <w:ind w:left="0" w:firstLine="0"/>
-      </w:pPr>
-      <w:r>
-        <w:rPr>
-          <w:b w:val="0"/>
-        </w:rPr>
-        <w:t>{{ summary }}</w:t>
-      </w:r>
-    </w:p>
-    <w:p>
-      <w:pPr>
-        <w:ind w:left="0" w:firstLine="0"/>
-      </w:pPr>
-      <w:r>
-        <w:rPr>
-          <w:b w:val="0"/>
-        </w:rPr>
-        <w:t>{% if town %}Resides in {{ town }}.{% endif %}</w:t>
-      </w:r>
-    </w:p>
-    <w:p>
-      <w:pPr>
-        <w:pStyle w:val="CVControlTag"/>
-        <w:ind w:left="0" w:firstLine="0"/>
-      </w:pPr>
-      <w:r>
-        <w:rPr>
-          <w:b w:val="0"/>
-        </w:rPr>
-        <w:t>{% for item in skills_items %}</w:t>
-      </w:r>
-    </w:p>
-    <w:p>
-      <w:pPr>
-        <w:ind w:left="360" w:firstLine="0"/>
-      </w:pPr>
-      <w:r>
-        <w:rPr>
-          <w:b w:val="0"/>
-        </w:rPr>
-        <w:t>• {{ item }}</w:t>
-      </w:r>
-    </w:p>
-    <w:p>
-      <w:pPr>
-        <w:pStyle w:val="CVControlTag"/>
-        <w:ind w:left="0" w:firstLine="0"/>
-      </w:pPr>
-      <w:r>
-        <w:rPr>
-          <w:b w:val="0"/>
-        </w:rPr>
-        <w:t>{% endfor %}</w:t>
-      </w:r>
-    </w:p>
-    <w:p>
-      <w:pPr>
+      </w:pPr>
+      <w:r>
         <w:rPr>
           <w:b/>
           <w:bCs/>
           <w:u w:val="single"/>
         </w:rPr>
-      </w:pPr>
-      <w:r>
+        <w:t>Professional Experience:</w:t>
+      </w:r>
+    </w:p>
+    <w:p>
+      <w:pPr>
+        <w:pStyle w:val="CVControlTag"/>
+        <w:ind w:left="0" w:firstLine="0"/>
+      </w:pPr>
+      <w:r>
+        <w:rPr>
+          <w:b w:val="0"/>
+        </w:rPr>
+        <w:t>{% for company in experience_companies %}</w:t>
+      </w:r>
+    </w:p>
+    <w:p>
+      <w:pPr>
+        <w:tabs>
+          <w:tab w:pos="9360" w:val="right"/>
+        </w:tabs>
+        <w:ind w:left="0" w:firstLine="0"/>
+      </w:pPr>
+      <w:r>
+        <w:rPr>
+          <w:b/>
+        </w:rPr>
+        <w:t>{{ company.header }}</w:t>
+      </w:r>
+    </w:p>
+    <w:p>
+      <w:pPr>
+        <w:tabs>
+          <w:tab w:pos="9360" w:val="right"/>
+        </w:tabs>
+        <w:ind w:left="0" w:firstLine="0"/>
+      </w:pPr>
+      <w:r>
+        <w:rPr>
+          <w:b/>
+        </w:rPr>
+        <w:t>{% for role in company.roles %}</w:t>
+      </w:r>
+    </w:p>
+    <w:p>
+      <w:pPr>
+        <w:ind w:left="0" w:firstLine="0"/>
+      </w:pPr>
+      <w:r>
+        <w:rPr>
+          <w:b/>
+        </w:rPr>
+        <w:t>{{ role.header }}</w:t>
+      </w:r>
+    </w:p>
+    <w:p>
+      <w:pPr>
+        <w:pStyle w:val="CVControlTag"/>
+        <w:ind w:left="0" w:firstLine="0"/>
+      </w:pPr>
+      <w:r>
+        <w:rPr>
+          <w:b w:val="0"/>
+        </w:rPr>
+        <w:t>{% for b in role.bullets %}</w:t>
+      </w:r>
+    </w:p>
+    <w:p>
+      <w:pPr>
+        <w:ind w:left="360" w:firstLine="0"/>
+      </w:pPr>
+      <w:r>
+        <w:rPr>
+          <w:b w:val="0"/>
+        </w:rPr>
+        <w:t>- {{ b }}</w:t>
+      </w:r>
+    </w:p>
+    <w:p>
+      <w:pPr>
+        <w:pStyle w:val="CVControlTag"/>
+        <w:ind w:left="0" w:firstLine="0"/>
+      </w:pPr>
+      <w:r>
+        <w:rPr>
+          <w:b w:val="0"/>
+        </w:rPr>
+        <w:t>{% endfor %}</w:t>
+      </w:r>
+    </w:p>
+    <w:p>
+      <w:pPr>
+        <w:pStyle w:val="CVControlTag"/>
+        <w:ind w:left="0" w:firstLine="0"/>
+      </w:pPr>
+      <w:r>
+        <w:rPr>
+          <w:b w:val="0"/>
+        </w:rPr>
+        <w:t>{% endfor %}</w:t>
+      </w:r>
+    </w:p>
+    <w:p>
+      <w:pPr>
+        <w:pStyle w:val="CVControlTag"/>
+        <w:ind w:left="0" w:firstLine="0"/>
+      </w:pPr>
+      <w:r>
+        <w:rPr>
+          <w:b w:val="0"/>
+        </w:rPr>
+        <w:t>{% endfor %}</w:t>
+      </w:r>
+    </w:p>
+    <w:p>
+      <w:pPr>
         <w:rPr>
           <w:b/>
           <w:bCs/>
           <w:u w:val="single"/>
         </w:rPr>
-        <w:t>Professional Experience</w:t>
-      </w:r>
-    </w:p>
-    <w:p>
-      <w:pPr>
-        <w:pStyle w:val="CVControlTag"/>
-        <w:ind w:left="0" w:firstLine="0"/>
-      </w:pPr>
-      <w:r>
-        <w:rPr>
-          <w:b w:val="0"/>
-        </w:rPr>
-        <w:t>{% for job in experience_jobs %}</w:t>
-      </w:r>
-    </w:p>
-    <w:p>
-      <w:pPr>
-        <w:ind w:left="0" w:firstLine="0"/>
-      </w:pPr>
-      <w:r>
-        <w:rPr>
-          <w:b/>
-        </w:rPr>
-        <w:t>{{ job.header }}</w:t>
-      </w:r>
-    </w:p>
-    <w:p>
-      <w:pPr>
-        <w:pStyle w:val="CVControlTag"/>
-        <w:ind w:left="0" w:firstLine="0"/>
-      </w:pPr>
-      <w:r>
-        <w:rPr>
-          <w:b w:val="0"/>
-        </w:rPr>
-        <w:t>{% for b in job.bullets %}</w:t>
-      </w:r>
-    </w:p>
-    <w:p>
-      <w:pPr>
-        <w:ind w:left="360" w:firstLine="0"/>
-      </w:pPr>
-      <w:r>
-        <w:rPr>
-          <w:b w:val="0"/>
-        </w:rPr>
-        <w:t>• {{ b }}</w:t>
-      </w:r>
-    </w:p>
-    <w:p>
-      <w:pPr>
-        <w:pStyle w:val="CVControlTag"/>
-        <w:ind w:left="0" w:firstLine="0"/>
-      </w:pPr>
-      <w:r>
-        <w:rPr>
-          <w:b w:val="0"/>
-        </w:rPr>
-        <w:t>{% endfor %}</w:t>
-      </w:r>
-    </w:p>
-    <w:p>
-      <w:pPr>
-        <w:pStyle w:val="CVControlTag"/>
-        <w:ind w:left="0" w:firstLine="0"/>
-      </w:pPr>
-      <w:r>
-        <w:rPr>
-          <w:b w:val="0"/>
-        </w:rPr>
-        <w:t>{% endfor %}</w:t>
-      </w:r>
-    </w:p>
-    <w:p>
-      <w:pPr>
+      </w:pPr>
+      <w:r>
         <w:rPr>
           <w:b/>
           <w:bCs/>
           <w:u w:val="single"/>
         </w:rPr>
-      </w:pPr>
+        <w:t>Education/Certifications</w:t>
+      </w:r>
       <w:r>
         <w:rPr>
           <w:b/>
           <w:bCs/>
           <w:u w:val="single"/>
         </w:rPr>
-        <w:t>Education/Certifications</w:t>
-      </w:r>
-      <w:r>
-        <w:rPr>
-          <w:b/>
-          <w:bCs/>
-          <w:u w:val="single"/>
-        </w:rPr>
         <w:t>/Licenses</w:t>
       </w:r>
     </w:p>
@@ -238,7 +224,7 @@
         <w:rPr>
           <w:b w:val="0"/>
         </w:rPr>
-        <w:t>• {{ item }}</w:t>
+        <w:t>- {{ item }}</w:t>
       </w:r>
     </w:p>
     <w:p>

</xml_diff>

<commit_message>
Corregir parrafo fantasma entre empresa y primer cargo en los 3 templates
El tag "{% for role in company.roles %}" nunca tuvo el estilo CVControlTag
que si tienen sus hermanos {% endfor %} -- strip_empty_paragraphs() solo
limpia parrafos con ese estilo, asi que quedaba como parrafo vacio con el
tab/spacing viejo (10pt) heredado de company.header. Bug preexistente,
enmascarado antes porque todo tenia spacing=200 por igual; se volvio
visible al ajustar el resto del espaciado.

Co-Authored-By: Claude Sonnet 5 <noreply@anthropic.com>
</commit_message>
<xml_diff>
--- a/02-modulo2-agente-transformacion/microservicio/templates/anotados/BD - Resume Template.docx
+++ b/02-modulo2-agente-transformacion/microservicio/templates/anotados/BD - Resume Template.docx
@@ -97,9 +97,7 @@
     </w:p>
     <w:p>
       <w:pPr>
-        <w:tabs>
-          <w:tab w:pos="9360" w:val="right"/>
-        </w:tabs>
+        <w:pStyle w:val="CVControlTag"/>
         <w:ind w:left="0" w:firstLine="0"/>
       </w:pPr>
       <w:r>

</xml_diff>

<commit_message>
Calibrar BD Format contra canon de Edgeliz/Edward y verificar con candidata real
Corrige color de texto, spacing, justificado, indent de bullets/rol, separacion
de educacion/certificaciones, mayusculas de nombre/localidad y sangria de bullets
(tab real en vez de espacio) contra el canon de BD. Verificado end-to-end en local
(sin N8N) con Ruth Sotomayor Clavell, candidata real encontrada via api.jazz.co,
lo que encontro y corrigio ademas un bug real de `town` ausente.

Co-Authored-By: Claude Sonnet 5 <noreply@anthropic.com>
</commit_message>
<xml_diff>
--- a/02-modulo2-agente-transformacion/microservicio/templates/anotados/BD - Resume Template.docx
+++ b/02-modulo2-agente-transformacion/microservicio/templates/anotados/BD - Resume Template.docx
@@ -8,24 +8,39 @@
         <w:jc w:val="center"/>
       </w:pPr>
       <w:r>
-        <w:t>{{ full_name }}</w:t>
+        <w:t>{{ full_name|upper }}</w:t>
+      </w:r>
+    </w:p>
+    <w:p>
+      <w:pPr>
+        <w:pStyle w:val="CVControlTag"/>
+        <w:ind w:left="0" w:firstLine="0"/>
+      </w:pPr>
+      <w:r>
+        <w:t>{% if town %}</w:t>
       </w:r>
     </w:p>
     <w:p>
       <w:pPr>
         <w:jc w:val="center"/>
-      </w:pPr>
-      <w:r>
-        <w:t>{% if town %}{{ town }}{% endif %}</w:t>
-      </w:r>
-    </w:p>
-    <w:p>
-      <w:pPr>
-        <w:jc w:val="center"/>
-      </w:pPr>
-    </w:p>
-    <w:p>
-      <w:pPr>
+        <w:spacing w:before="240" w:after="0"/>
+      </w:pPr>
+      <w:r>
+        <w:t>{{ town|upper }}</w:t>
+      </w:r>
+    </w:p>
+    <w:p>
+      <w:pPr>
+        <w:pStyle w:val="CVControlTag"/>
+        <w:ind w:left="0" w:firstLine="0"/>
+      </w:pPr>
+      <w:r>
+        <w:t>{% endif %}</w:t>
+      </w:r>
+    </w:p>
+    <w:p>
+      <w:pPr>
+        <w:spacing w:before="240" w:after="0"/>
         <w:rPr>
           <w:b/>
           <w:bCs/>
@@ -43,6 +58,8 @@
     </w:p>
     <w:p>
       <w:pPr>
+        <w:spacing w:before="240" w:after="0"/>
+        <w:jc w:val="both"/>
         <w:ind w:left="0" w:firstLine="0"/>
       </w:pPr>
       <w:r>
@@ -54,6 +71,7 @@
     </w:p>
     <w:p>
       <w:pPr>
+        <w:spacing w:before="240" w:after="0"/>
         <w:rPr>
           <w:b/>
           <w:bCs/>
@@ -86,7 +104,9 @@
         <w:tabs>
           <w:tab w:pos="9360" w:val="right"/>
         </w:tabs>
-        <w:ind w:left="0" w:firstLine="0"/>
+        <w:spacing w:before="240" w:after="0"/>
+        <w:ind w:left="0" w:firstLine="0"/>
+        <w:keepNext/>
       </w:pPr>
       <w:r>
         <w:rPr>
@@ -109,7 +129,9 @@
     </w:p>
     <w:p>
       <w:pPr>
-        <w:ind w:left="0" w:firstLine="0"/>
+        <w:spacing w:before="0" w:after="0"/>
+        <w:ind w:left="360" w:firstLine="0"/>
+        <w:keepNext/>
       </w:pPr>
       <w:r>
         <w:rPr>
@@ -132,13 +154,30 @@
     </w:p>
     <w:p>
       <w:pPr>
-        <w:ind w:left="360" w:firstLine="0"/>
+        <w:tabs>
+          <w:tab w:pos="720" w:val="left"/>
+        </w:tabs>
+        <w:spacing w:before="0" w:after="0"/>
+        <w:jc w:val="both"/>
+        <w:ind w:left="720" w:hanging="360"/>
       </w:pPr>
       <w:r>
         <w:rPr>
           <w:b w:val="0"/>
         </w:rPr>
-        <w:t>- {{ b }}</w:t>
+        <w:t>-</w:t>
+      </w:r>
+      <w:r>
+        <w:rPr>
+          <w:b w:val="0"/>
+        </w:rPr>
+        <w:tab/>
+      </w:r>
+      <w:r>
+        <w:rPr>
+          <w:b w:val="0"/>
+        </w:rPr>
+        <w:t>{{ b }}</w:t>
       </w:r>
     </w:p>
     <w:p>
@@ -179,6 +218,7 @@
     </w:p>
     <w:p>
       <w:pPr>
+        <w:spacing w:before="240" w:after="0"/>
         <w:rPr>
           <w:b/>
           <w:bCs/>
@@ -211,18 +251,68 @@
         <w:rPr>
           <w:b w:val="0"/>
         </w:rPr>
-        <w:t>{% for item in education_certifications_items %}</w:t>
-      </w:r>
-    </w:p>
-    <w:p>
-      <w:pPr>
-        <w:ind w:left="360" w:firstLine="0"/>
+        <w:t>{% for item in education_items %}</w:t>
+      </w:r>
+    </w:p>
+    <w:p>
+      <w:pPr>
+        <w:spacing w:before="240" w:after="0"/>
+        <w:ind w:left="0" w:firstLine="0"/>
+        <w:keepNext/>
+      </w:pPr>
+      <w:r>
+        <w:rPr>
+          <w:b/>
+        </w:rPr>
+        <w:t>{{ item.degree }}</w:t>
+      </w:r>
+    </w:p>
+    <w:p>
+      <w:pPr>
+        <w:spacing w:before="0" w:after="0"/>
+        <w:ind w:left="0" w:firstLine="0"/>
       </w:pPr>
       <w:r>
         <w:rPr>
           <w:b w:val="0"/>
         </w:rPr>
-        <w:t>- {{ item }}</w:t>
+        <w:t>{{ item.institution }}</w:t>
+      </w:r>
+    </w:p>
+    <w:p>
+      <w:pPr>
+        <w:pStyle w:val="CVControlTag"/>
+        <w:ind w:left="0" w:firstLine="0"/>
+      </w:pPr>
+      <w:r>
+        <w:rPr>
+          <w:b w:val="0"/>
+        </w:rPr>
+        <w:t>{% endfor %}</w:t>
+      </w:r>
+    </w:p>
+    <w:p>
+      <w:pPr>
+        <w:pStyle w:val="CVControlTag"/>
+        <w:ind w:left="0" w:firstLine="0"/>
+      </w:pPr>
+      <w:r>
+        <w:rPr>
+          <w:b w:val="0"/>
+        </w:rPr>
+        <w:t>{% for item in certifications_items %}</w:t>
+      </w:r>
+    </w:p>
+    <w:p>
+      <w:pPr>
+        <w:spacing w:before="240" w:after="0"/>
+        <w:ind w:left="0" w:firstLine="0"/>
+      </w:pPr>
+      <w:r>
+        <w:rPr>
+          <w:b w:val="0"/>
+        </w:rPr>
+        <w:t>{{ item }}</w:t>
       </w:r>
     </w:p>
     <w:p>
@@ -583,22 +673,10 @@
     <w:rPrDefault>
       <w:rPr>
         <w:rFonts w:ascii="Arial" w:eastAsia="Arial" w:hAnsi="Arial" w:cs="Arial"/>
-        <w:color w:val="67696F"/>
         <w:lang w:val="en-US" w:eastAsia="en-US" w:bidi="ar-SA"/>
       </w:rPr>
     </w:rPrDefault>
-    <w:pPrDefault>
-      <w:pPr>
-        <w:pBdr>
-          <w:top w:val="nil"/>
-          <w:left w:val="nil"/>
-          <w:bottom w:val="nil"/>
-          <w:right w:val="nil"/>
-          <w:between w:val="nil"/>
-        </w:pBdr>
-        <w:spacing w:after="200"/>
-      </w:pPr>
-    </w:pPrDefault>
+    <w:pPrDefault/>
   </w:docDefaults>
   <w:latentStyles w:defLockedState="0" w:defUIPriority="99" w:defSemiHidden="0" w:defUnhideWhenUsed="0" w:defQFormat="0" w:count="376">
     <w:lsdException w:name="Normal" w:uiPriority="0" w:qFormat="1"/>

</xml_diff>